<commit_message>
Update template, fitur delete and footer
</commit_message>
<xml_diff>
--- a/public/templates/pricetag/disc-reg-tgg-allocation.docx
+++ b/public/templates/pricetag/disc-reg-tgg-allocation.docx
@@ -17,20 +17,7 @@
           <w:noProof/>
           <w:lang w:val="en-US"/>
         </w:rPr>
-        <w:pict w14:anchorId="13DE6945">
-          <v:shapetype id="_x0000_t32" coordsize="21600,21600" o:spt="32" o:oned="t" path="m,l21600,21600e" filled="f">
-            <v:path arrowok="t" fillok="f" o:connecttype="none"/>
-            <o:lock v:ext="edit" shapetype="t"/>
-          </v:shapetype>
-          <v:shape id="_x0000_s1079" type="#_x0000_t32" style="position:absolute;margin-left:292.05pt;margin-top:5pt;width:68.1pt;height:7pt;flip:y;z-index:251694080" o:connectortype="straight" strokecolor="#e00" strokeweight="1pt"/>
-        </w:pict>
-      </w:r>
-      <w:r>
-        <w:rPr>
-          <w:noProof/>
-          <w:lang w:val="en-US"/>
-        </w:rPr>
-        <w:pict w14:anchorId="28D0BE89">
+        <w:pict w14:anchorId="5A3ADBFE">
           <v:shapetype id="_x0000_t136" coordsize="21600,21600" o:spt="136" adj="10800" path="m@7,l@8,m@5,21600l@6,21600e">
             <v:formulas>
               <v:f eqn="sum #0 0 10800"/>
@@ -55,33 +42,58 @@
             </v:handles>
             <o:lock v:ext="edit" text="t" shapetype="t"/>
           </v:shapetype>
+          <v:shape id="_x0000_s1065" type="#_x0000_t136" style="position:absolute;margin-left:253.5pt;margin-top:-18pt;width:18pt;height:27pt;z-index:251679744" fillcolor="red" stroked="f" strokecolor="red" strokeweight="1.5pt">
+            <v:shadow color="#900"/>
+            <v:textpath style="font-family:&quot;Calisto MT&quot;;v-text-kern:t" trim="t" fitpath="t" string="%"/>
+          </v:shape>
+        </w:pict>
+      </w:r>
+      <w:r>
+        <w:rPr>
+          <w:noProof/>
+          <w:lang w:val="en-US"/>
+        </w:rPr>
+        <w:pict w14:anchorId="6B2A571F">
+          <v:shape id="_x0000_s1064" type="#_x0000_t136" style="position:absolute;margin-left:65.85pt;margin-top:-27pt;width:185.4pt;height:90pt;z-index:251678720" fillcolor="red" strokecolor="red" strokeweight="3pt">
+            <v:shadow color="#900"/>
+            <v:textpath style="font-family:&quot;Book Antiqua&quot;;font-weight:bold;v-text-kern:t" trim="t" fitpath="t" string="&lt;&lt;Program&gt;&gt;"/>
+          </v:shape>
+        </w:pict>
+      </w:r>
+      <w:r>
+        <w:rPr>
+          <w:noProof/>
+          <w:lang w:val="en-US"/>
+        </w:rPr>
+        <w:pict w14:anchorId="525D39CB">
+          <v:shape id="_x0000_s1062" type="#_x0000_t136" style="position:absolute;margin-left:-3.75pt;margin-top:3pt;width:63pt;height:40pt;z-index:251676672" fillcolor="#00b0f0" stroked="f" strokecolor="#002060" strokeweight="1.5pt">
+            <v:shadow color="#900"/>
+            <v:textpath style="font-family:&quot;Arial Narrow&quot;;font-weight:bold;v-text-kern:t" trim="t" fitpath="t" string="*Promo Berlaku&#10;Selama Alokasi&#10;Masih Ada"/>
+          </v:shape>
+        </w:pict>
+      </w:r>
+      <w:r>
+        <w:rPr>
+          <w:noProof/>
+          <w:lang w:val="en-US"/>
+        </w:rPr>
+        <w:pict w14:anchorId="13DE6945">
+          <v:shapetype id="_x0000_t32" coordsize="21600,21600" o:spt="32" o:oned="t" path="m,l21600,21600e" filled="f">
+            <v:path arrowok="t" fillok="f" o:connecttype="none"/>
+            <o:lock v:ext="edit" shapetype="t"/>
+          </v:shapetype>
+          <v:shape id="_x0000_s1079" type="#_x0000_t32" style="position:absolute;margin-left:292.05pt;margin-top:5pt;width:68.1pt;height:7pt;flip:y;z-index:251694080" o:connectortype="straight" strokecolor="#e00" strokeweight="1pt"/>
+        </w:pict>
+      </w:r>
+      <w:r>
+        <w:rPr>
+          <w:noProof/>
+          <w:lang w:val="en-US"/>
+        </w:rPr>
+        <w:pict w14:anchorId="28D0BE89">
           <v:shape id="_x0000_s1076" type="#_x0000_t136" style="position:absolute;margin-left:303.75pt;margin-top:-14pt;width:65.25pt;height:9pt;z-index:251691008" fillcolor="#00b0f0" stroked="f" strokecolor="#002060" strokeweight="1.5pt">
             <v:shadow color="#900"/>
             <v:textpath style="font-family:&quot;Arial Narrow&quot;;font-weight:bold;v-text-kern:t" trim="t" fitpath="t" string="AP : &lt;&lt;Periode&gt;&gt;"/>
-          </v:shape>
-        </w:pict>
-      </w:r>
-      <w:r>
-        <w:rPr>
-          <w:noProof/>
-          <w:lang w:val="en-US"/>
-        </w:rPr>
-        <w:pict w14:anchorId="6B2A571F">
-          <v:shape id="_x0000_s1064" type="#_x0000_t136" style="position:absolute;margin-left:64.35pt;margin-top:-27pt;width:185.4pt;height:90pt;z-index:251678720" fillcolor="red" strokecolor="red" strokeweight="3pt">
-            <v:shadow color="#900"/>
-            <v:textpath style="font-family:&quot;Book Antiqua&quot;;font-weight:bold;v-text-kern:t" trim="t" fitpath="t" string="&lt;&lt;Program&gt;&gt;"/>
-          </v:shape>
-        </w:pict>
-      </w:r>
-      <w:r>
-        <w:rPr>
-          <w:noProof/>
-          <w:lang w:val="en-US"/>
-        </w:rPr>
-        <w:pict w14:anchorId="525D39CB">
-          <v:shape id="_x0000_s1062" type="#_x0000_t136" style="position:absolute;margin-left:-11.25pt;margin-top:3pt;width:63pt;height:40pt;z-index:251676672" fillcolor="#00b0f0" stroked="f" strokecolor="#002060" strokeweight="1.5pt">
-            <v:shadow color="#900"/>
-            <v:textpath style="font-family:&quot;Arial Narrow&quot;;font-weight:bold;v-text-kern:t" trim="t" fitpath="t" string="*Promo Berlaku&#10;Selama Alokasi&#10;Masih Ada"/>
           </v:shape>
         </w:pict>
       </w:r>
@@ -178,18 +190,6 @@
           <v:shape id="_x0000_s1061" type="#_x0000_t136" style="position:absolute;margin-left:51.75pt;margin-top:-54pt;width:317.25pt;height:18pt;z-index:251675648" fillcolor="#00b0f0" strokecolor="black [3213]" strokeweight=".25pt">
             <v:shadow color="#900"/>
             <v:textpath style="font-family:&quot;Arial Black&quot;;font-weight:bold;v-text-kern:t" trim="t" fitpath="t" string="&lt;&lt;NamaBarang&gt;&gt;"/>
-          </v:shape>
-        </w:pict>
-      </w:r>
-      <w:r>
-        <w:rPr>
-          <w:noProof/>
-          <w:lang w:val="en-US"/>
-        </w:rPr>
-        <w:pict w14:anchorId="5A3ADBFE">
-          <v:shape id="_x0000_s1065" type="#_x0000_t136" style="position:absolute;margin-left:252pt;margin-top:-18pt;width:18pt;height:27pt;z-index:251679744" fillcolor="red" stroked="f" strokecolor="red" strokeweight="1.5pt">
-            <v:shadow color="#900"/>
-            <v:textpath style="font-family:&quot;Calisto MT&quot;;v-text-kern:t" trim="t" fitpath="t" string="%"/>
           </v:shape>
         </w:pict>
       </w:r>
@@ -224,6 +224,18 @@
           <w:lang w:val="en-US"/>
         </w:rPr>
       </w:pPr>
+      <w:r>
+        <w:rPr>
+          <w:noProof/>
+          <w:lang w:val="en-US"/>
+        </w:rPr>
+        <w:pict w14:anchorId="64F438B0">
+          <v:shape id="_x0000_s1077" type="#_x0000_t136" style="position:absolute;margin-left:-3.75pt;margin-top:26.55pt;width:63pt;height:9pt;z-index:251692032" fillcolor="red" stroked="f" strokecolor="#002060" strokeweight="1.5pt">
+            <v:shadow color="#900"/>
+            <v:textpath style="font-family:&quot;Arial Narrow&quot;;font-weight:bold;v-text-kern:t" trim="t" fitpath="t" string="Alokasi : &lt;&lt;Alokasi&gt;&gt;Pcs"/>
+          </v:shape>
+        </w:pict>
+      </w:r>
       <w:r>
         <w:rPr>
           <w:noProof/>
@@ -246,18 +258,6 @@
           <w:lang w:val="en-US"/>
         </w:rPr>
       </w:pPr>
-      <w:r>
-        <w:rPr>
-          <w:noProof/>
-          <w:lang w:val="en-US"/>
-        </w:rPr>
-        <w:pict w14:anchorId="64F438B0">
-          <v:shape id="_x0000_s1077" type="#_x0000_t136" style="position:absolute;margin-left:-11.25pt;margin-top:1.1pt;width:63pt;height:9pt;z-index:251692032" fillcolor="red" stroked="f" strokecolor="#002060" strokeweight="1.5pt">
-            <v:shadow color="#900"/>
-            <v:textpath style="font-family:&quot;Arial Narrow&quot;;font-weight:bold;v-text-kern:t" trim="t" fitpath="t" string="Alokasi : &lt;&lt;Alokasi&gt;&gt;Pcs"/>
-          </v:shape>
-        </w:pict>
-      </w:r>
       <w:r>
         <w:rPr>
           <w:lang w:val="en-US"/>

</xml_diff>